<commit_message>
link do repositório no README e na documentação
</commit_message>
<xml_diff>
--- a/docs/Documentacao_RA1_Data_Analytics.docx
+++ b/docs/Documentacao_RA1_Data_Analytics.docx
@@ -141,10 +141,8 @@
         <w:t xml:space="preserve">Repositório  </w:t>
       </w:r>
       <w:r>
-        <w:rPr>
-          <w:color w:val="606066"/>
-        </w:rPr>
-        <w:t>[Link do projeto]</w:t>
+        <w:rPr/>
+        <w:t>https://github.com/rafaeusn/padaria-data-analytics</w:t>
       </w:r>
     </w:p>
     <w:p>
@@ -11138,10 +11136,8 @@
         <w:t xml:space="preserve">Repositório e versão  </w:t>
       </w:r>
       <w:r>
-        <w:rPr>
-          <w:color w:val="606066"/>
-        </w:rPr>
-        <w:t>[URL • branch, tag ou commit da entrega]</w:t>
+        <w:rPr/>
+        <w:t>https://github.com/rafaeusn/padaria-data-analytics • branch main • tag entrega (versão entregue)</w:t>
       </w:r>
     </w:p>
     <w:p>

</xml_diff>

<commit_message>
identificação do curso, da professora e da entrega
</commit_message>
<xml_diff>
--- a/docs/Documentacao_RA1_Data_Analytics.docx
+++ b/docs/Documentacao_RA1_Data_Analytics.docx
@@ -92,10 +92,8 @@
         <w:t xml:space="preserve">Curso e turma  </w:t>
       </w:r>
       <w:r>
-        <w:rPr>
-          <w:color w:val="606066"/>
-        </w:rPr>
-        <w:t>[Curso • turma • período letivo]</w:t>
+        <w:rPr/>
+        <w:t>Sistemas de Informação • 6º período</w:t>
       </w:r>
     </w:p>
     <w:p>
@@ -109,10 +107,8 @@
         <w:t xml:space="preserve">Professor ou professora  </w:t>
       </w:r>
       <w:r>
-        <w:rPr>
-          <w:color w:val="606066"/>
-        </w:rPr>
-        <w:t>[Nome]</w:t>
+        <w:rPr/>
+        <w:t>Marina de Lara</w:t>
       </w:r>
     </w:p>
     <w:p>
@@ -156,10 +152,8 @@
         <w:t xml:space="preserve">Entrega  </w:t>
       </w:r>
       <w:r>
-        <w:rPr>
-          <w:color w:val="606066"/>
-        </w:rPr>
-        <w:t>[Cidade • dia/mês/ano]</w:t>
+        <w:rPr/>
+        <w:t>Curitiba • 20/10/2026</w:t>
       </w:r>
     </w:p>
     <w:p>

</xml_diff>

<commit_message>
adiciona a figura das validações na verificação de reprodução
</commit_message>
<xml_diff>
--- a/docs/Documentacao_RA1_Data_Analytics.docx
+++ b/docs/Documentacao_RA1_Data_Analytics.docx
@@ -11932,7 +11932,58 @@
       </w:pPr>
       <w:r>
         <w:rPr/>
-        <w:t>Em 20/10/2026, clonamos o repositório em uma pasta nova e executamos o notebook do início ao fim com jupyter nbconvert --execute, no Windows 11 com Python 3.12.10. Todas as células rodaram sem erro, as 12 validações da seção 6 terminaram com OK e o arquivo data/processed/bakery_sales_preparado.csv foi gerado com 19.321 linhas e 42 colunas, idêntico ao que está versionado.</w:t>
+        <w:t>Em 20/10/2026, clonamos o repositório em uma pasta nova e executamos o notebook do início ao fim com jupyter nbconvert --execute, no Windows 11 com Python 3.12.10. Todas as células rodaram sem erro, as 12 validações da seção 6 terminaram com OK e o arquivo data/processed/bakery_sales_preparado.csv foi gerado com 19.321 linhas e 42 colunas, idêntico ao que está versionado. A figura abaixo mostra a saída da célula de validação dessa execução.</w:t>
+      </w:r>
+    </w:p>
+    <w:p>
+      <w:pPr>
+        <w:spacing w:after="160"/>
+      </w:pPr>
+      <w:r>
+        <w:drawing>
+          <wp:inline xmlns:a="http://schemas.openxmlformats.org/drawingml/2006/main" xmlns:pic="http://schemas.openxmlformats.org/drawingml/2006/picture">
+            <wp:extent cx="3060000" cy="2372093"/>
+            <wp:docPr id="1" name="Picture 1"/>
+            <wp:cNvGraphicFramePr>
+              <a:graphicFrameLocks noChangeAspect="1"/>
+            </wp:cNvGraphicFramePr>
+            <a:graphic>
+              <a:graphicData uri="http://schemas.openxmlformats.org/drawingml/2006/picture">
+                <pic:pic>
+                  <pic:nvPicPr>
+                    <pic:cNvPr id="0" name="fig_validacoes.png"/>
+                    <pic:cNvPicPr/>
+                  </pic:nvPicPr>
+                  <pic:blipFill>
+                    <a:blip r:embed="rId11"/>
+                    <a:stretch>
+                      <a:fillRect/>
+                    </a:stretch>
+                  </pic:blipFill>
+                  <pic:spPr>
+                    <a:xfrm>
+                      <a:off x="0" y="0"/>
+                      <a:ext cx="3060000" cy="2372093"/>
+                    </a:xfrm>
+                    <a:prstGeom prst="rect"/>
+                  </pic:spPr>
+                </pic:pic>
+              </a:graphicData>
+            </a:graphic>
+          </wp:inline>
+        </w:drawing>
+      </w:r>
+    </w:p>
+    <w:p>
+      <w:pPr>
+        <w:spacing w:after="160"/>
+      </w:pPr>
+      <w:r>
+        <w:rPr>
+          <w:i/>
+          <w:sz w:val="18"/>
+        </w:rPr>
+        <w:t>Figura 1. Validações da seção 6 do projeto_data_analytics.ipynb após a execução completa (20/10/2026).</w:t>
       </w:r>
     </w:p>
     <w:p>

</xml_diff>